<commit_message>
adições 9 ao 13
</commit_message>
<xml_diff>
--- a/Pandemic-Crysis-main/Relatório de Desenvolvimento - Pandemic Crysis.docx
+++ b/Pandemic-Crysis-main/Relatório de Desenvolvimento - Pandemic Crysis.docx
@@ -468,6 +468,222 @@
           <w:rtl w:val="0"/>
         </w:rPr>
         <w:t xml:space="preserve">O cadastro de sintomas das patologias e a ampliação do banco de doenças permanecem em aberto e condicionam a variedade da fase de triagem. Prevê-se ainda o aproveitamento do bônus de velocidade de exame, já disponível nos controladores, como base para um cronômetro de expediente.</w:t>
+      </w:r>
+    </w:p>
+    <w:p>
+      <w:pPr>
+        <w:spacing w:after="240" w:before="240" w:lineRule="auto"/>
+        <w:rPr/>
+      </w:pPr>
+      <w:r>
+        <w:rPr>
+          <w:rtl w:val="0"/>
+        </w:rPr>
+        <w:t xml:space="preserve">9. Correção do Estado Persistente entre Partidas</w:t>
+      </w:r>
+    </w:p>
+    <w:p>
+      <w:pPr>
+        <w:spacing w:after="240" w:before="240" w:lineRule="auto"/>
+        <w:rPr/>
+      </w:pPr>
+      <w:r>
+        <w:rPr>
+          <w:rtl w:val="0"/>
+        </w:rPr>
+        <w:t xml:space="preserve">Os testes revelaram que uma nova partida herdava integralmente o estado da anterior. A causa está na arquitetura de autoloads: os controladores globais não são destruídos na troca de cenas, e nenhuma rotina reestabelecia seus valores iniciais. O efeito não se restringia ao saldo — dia corrente, semana, melhorias adquiridas e o contador de metas não cumpridas também transitavam entre partidas. Em um caso específico, após o encerramento por falência os contadores de atendimento permaneciam no limite do turno, e a partida seguinte iniciava com a sala de espera já esgotada, impedindo qualquer atendimento.</w:t>
+      </w:r>
+    </w:p>
+    <w:p>
+      <w:pPr>
+        <w:spacing w:after="240" w:before="240" w:lineRule="auto"/>
+        <w:rPr/>
+      </w:pPr>
+      <w:r>
+        <w:rPr>
+          <w:rtl w:val="0"/>
+        </w:rPr>
+        <w:t xml:space="preserve">Foram implementadas rotinas de reinicialização em ambos os controladores, acionadas pelo botão de início do menu principal. Registra-se que a recarga do banco de doenças não deve ser incluída nessa rotina, sob pena de duplicar o acervo a cada partida.</w:t>
+      </w:r>
+    </w:p>
+    <w:p>
+      <w:pPr>
+        <w:spacing w:after="240" w:before="240" w:lineRule="auto"/>
+        <w:rPr/>
+      </w:pPr>
+      <w:r>
+        <w:rPr>
+          <w:rtl w:val="0"/>
+        </w:rPr>
+        <w:t xml:space="preserve">10. Revisão da Jogabilidade da Triagem</w:t>
+      </w:r>
+    </w:p>
+    <w:p>
+      <w:pPr>
+        <w:spacing w:after="240" w:before="240" w:lineRule="auto"/>
+        <w:rPr/>
+      </w:pPr>
+      <w:r>
+        <w:rPr>
+          <w:rtl w:val="0"/>
+        </w:rPr>
+        <w:t xml:space="preserve">Sessões de teste evidenciaram que o jogador podia progredir sem interpretar o quadro clínico. Duas causas foram identificadas e corrigidas.</w:t>
+      </w:r>
+    </w:p>
+    <w:p>
+      <w:pPr>
+        <w:spacing w:after="240" w:before="240" w:lineRule="auto"/>
+        <w:rPr/>
+      </w:pPr>
+      <w:r>
+        <w:rPr>
+          <w:rtl w:val="0"/>
+        </w:rPr>
+        <w:t xml:space="preserve">A primeira era a exibição integral e invariável dos sintomas: bastava memorizar um único sintoma para identificar a patologia. O prontuário passou a apresentar apenas parte do quadro, sorteada a cada ficha, tornando o relato genuinamente incompleto.</w:t>
+      </w:r>
+    </w:p>
+    <w:p>
+      <w:pPr>
+        <w:spacing w:after="240" w:before="240" w:lineRule="auto"/>
+        <w:rPr/>
+      </w:pPr>
+      <w:r>
+        <w:rPr>
+          <w:rtl w:val="0"/>
+        </w:rPr>
+        <w:t xml:space="preserve">Como contrapartida, foi implementado o exame complementar: mediante custo, o jogador revela um sintoma adicional do paciente em atendimento. A incerteza deixa de ser um obstáculo arbitrário e passa a constituir uma decisão econômica — pagar pela certeza ou arriscar o diagnóstico.</w:t>
+      </w:r>
+    </w:p>
+    <w:p>
+      <w:pPr>
+        <w:spacing w:after="240" w:before="240" w:lineRule="auto"/>
+        <w:rPr/>
+      </w:pPr>
+      <w:r>
+        <w:rPr>
+          <w:rtl w:val="0"/>
+        </w:rPr>
+        <w:t xml:space="preserve">Revisou-se ainda a decisão registrada na seção 7. A meta diária deixou de funcionar como limite e passou a operar como piso, sendo o teto de atendimentos estabelecido acima dela. O expediente encerra-se automaticamente ao atingir esse teto. O jogador recupera, assim, a decisão de encerrar no mínimo exigido ou estender o turno para financiar melhorias.</w:t>
+      </w:r>
+    </w:p>
+    <w:p>
+      <w:pPr>
+        <w:spacing w:after="240" w:before="240" w:lineRule="auto"/>
+        <w:rPr/>
+      </w:pPr>
+      <w:r>
+        <w:rPr>
+          <w:rtl w:val="0"/>
+        </w:rPr>
+        <w:t xml:space="preserve">Completam a revisão um placar de acertos e erros no cabeçalho, atalhos de teclado para as condutas médicas e um comando de saída da partida, anteriormente possível apenas pelo encerramento da aplicação.</w:t>
+      </w:r>
+    </w:p>
+    <w:p>
+      <w:pPr>
+        <w:spacing w:after="240" w:before="240" w:lineRule="auto"/>
+        <w:rPr/>
+      </w:pPr>
+      <w:r>
+        <w:rPr>
+          <w:rtl w:val="0"/>
+        </w:rPr>
+        <w:t xml:space="preserve">11. Balanceamento e Dificuldade Progressiva</w:t>
+      </w:r>
+    </w:p>
+    <w:p>
+      <w:pPr>
+        <w:spacing w:after="240" w:before="240" w:lineRule="auto"/>
+        <w:rPr/>
+      </w:pPr>
+      <w:r>
+        <w:rPr>
+          <w:rtl w:val="0"/>
+        </w:rPr>
+        <w:t xml:space="preserve">A ausência de penalidade para diagnósticos incorretos tornava a leitura dos sintomas dispensável: um teste em que todas as condutas foram escolhidas aleatoriamente alcançou a terceira semana com saldo superior a nove mil. Instituiu-se penalidade financeira por erro de triagem.</w:t>
+      </w:r>
+    </w:p>
+    <w:p>
+      <w:pPr>
+        <w:spacing w:after="240" w:before="240" w:lineRule="auto"/>
+        <w:rPr/>
+      </w:pPr>
+      <w:r>
+        <w:rPr>
+          <w:rtl w:val="0"/>
+        </w:rPr>
+        <w:t xml:space="preserve">Constatou-se também que o vocabulário dos sintomas não era padronizado. Como a comparação é textual, variações como "Febre", "Febre alta" e "Febre aguda" constituíam sintomas distintos para o sistema, e nenhuma patologia compartilhava sintomas com outra. O vocabulário foi unificado, estabelecendo sobreposições reais entre os quadros e viabilizando o diagnóstico diferencial.</w:t>
+      </w:r>
+    </w:p>
+    <w:p>
+      <w:pPr>
+        <w:spacing w:after="240" w:before="240" w:lineRule="auto"/>
+        <w:rPr/>
+      </w:pPr>
+      <w:r>
+        <w:rPr>
+          <w:rtl w:val="0"/>
+        </w:rPr>
+        <w:t xml:space="preserve">A progressão de dificuldade foi redistribuída: a meta diária mantém-se estável no início e eleva-se apenas na etapa final, enquanto o custo de manutenção cresce a cada semana. Deslocou-se a pressão da repetição para a gestão de recursos. Corrigiu-se ainda a semana de aparição de três patologias que, cadastradas para a quarta semana, jamais poderiam surgir em uma campanha de vinte e um dias.</w:t>
+      </w:r>
+    </w:p>
+    <w:p>
+      <w:pPr>
+        <w:spacing w:after="240" w:before="240" w:lineRule="auto"/>
+        <w:rPr/>
+      </w:pPr>
+      <w:r>
+        <w:rPr>
+          <w:rtl w:val="0"/>
+        </w:rPr>
+        <w:t xml:space="preserve">Por fim, a verificação de falência passou a ser imediata: anteriormente restrita ao fechamento diário, permitia que a partida prosseguisse com saldo negativo até o fim do turno.</w:t>
+      </w:r>
+    </w:p>
+    <w:p>
+      <w:pPr>
+        <w:spacing w:after="240" w:before="240" w:lineRule="auto"/>
+        <w:rPr/>
+      </w:pPr>
+      <w:r>
+        <w:rPr>
+          <w:rtl w:val="0"/>
+        </w:rPr>
+        <w:t xml:space="preserve">12. Persistência de Progresso</w:t>
+      </w:r>
+    </w:p>
+    <w:p>
+      <w:pPr>
+        <w:spacing w:after="240" w:before="240" w:lineRule="auto"/>
+        <w:rPr/>
+      </w:pPr>
+      <w:r>
+        <w:rPr>
+          <w:rtl w:val="0"/>
+        </w:rPr>
+        <w:t xml:space="preserve">Implementou-se sistema de salvamento em arquivo, com registro automático no início de cada dia e no momento em que o jogador opta por sair. O menu principal passou a apresentar a opção de retomada, exibida somente quando há partida em curso. O registro é descartado ao término da partida, de modo que as condições de derrota permanecem definitivas.</w:t>
+      </w:r>
+    </w:p>
+    <w:p>
+      <w:pPr>
+        <w:spacing w:after="240" w:before="240" w:lineRule="auto"/>
+        <w:rPr/>
+      </w:pPr>
+      <w:r>
+        <w:rPr>
+          <w:rtl w:val="0"/>
+        </w:rPr>
+        <w:t xml:space="preserve">13. Pendências Atualizadas</w:t>
+      </w:r>
+    </w:p>
+    <w:p>
+      <w:pPr>
+        <w:spacing w:after="240" w:before="240" w:lineRule="auto"/>
+        <w:rPr/>
+      </w:pPr>
+      <w:r>
+        <w:rPr>
+          <w:rtl w:val="0"/>
+        </w:rPr>
+        <w:t xml:space="preserve">Permanece em aberto o efeito das melhorias adquiridas na loja: a compra desconta o valor correspondente, porém as variáveis alteradas ainda não são consumidas por nenhuma tela. Enquanto essa integração não ocorrer, os valores de economia devem ser tratados como provisórios, uma vez que o equilíbrio depende do retorno oferecido pelos investimentos. Registra-se igualmente a ausência de tela de conclusão para a campanha concluída com êxito.</w:t>
       </w:r>
     </w:p>
     <w:p>

</xml_diff>